<commit_message>
chore(flatTalk): checkpoint - sojourn map art pipeline, agent and template card updates
Checkpoint snapshot of tracked source changes (296 files). Excludes .env and data/api-keys.json. Untracked temp logs and generated artifacts left in working tree.
</commit_message>
<xml_diff>
--- a/防城港市AI养老试点5条旅居养老线路产品设计方案（大健康产业协会牵头落地版）.docx
+++ b/防城港市AI养老试点5条旅居养老线路产品设计方案（大健康产业协会牵头落地版）.docx
@@ -1,6 +1,6 @@
 
 <file path=word/document.xml><?xml version="1.0" encoding="utf-8"?>
-<w:document xmlns:wpc="http://schemas.microsoft.com/office/word/2010/wordprocessingCanvas" xmlns:mc="http://schemas.openxmlformats.org/markup-compatibility/2006" xmlns:o="urn:schemas-microsoft-com:office:office" xmlns:r="http://schemas.openxmlformats.org/officeDocument/2006/relationships" xmlns:m="http://schemas.openxmlformats.org/officeDocument/2006/math" xmlns:v="urn:schemas-microsoft-com:vml" xmlns:wp14="http://schemas.microsoft.com/office/word/2010/wordprocessingDrawing" xmlns:wp="http://schemas.openxmlformats.org/drawingml/2006/wordprocessingDrawing" xmlns:w="http://schemas.openxmlformats.org/wordprocessingml/2006/main" xmlns:w14="http://schemas.microsoft.com/office/word/2010/wordml" xmlns:w10="urn:schemas-microsoft-com:office:word" xmlns:w15="http://schemas.microsoft.com/office/word/2012/wordml" xmlns:wpg="http://schemas.microsoft.com/office/word/2010/wordprocessingGroup" xmlns:wpi="http://schemas.microsoft.com/office/word/2010/wordprocessingInk" xmlns:wne="http://schemas.microsoft.com/office/word/2006/wordml" xmlns:wps="http://schemas.microsoft.com/office/word/2010/wordprocessingShape" xmlns:wpsCustomData="http://www.wps.cn/officeDocument/2013/wpsCustomData" mc:Ignorable="w14 w15 wp14">
+<w:document xmlns:wpc="http://schemas.microsoft.com/office/word/2010/wordprocessingCanvas" xmlns:cx="http://schemas.microsoft.com/office/drawing/2014/chartex" xmlns:cx1="http://schemas.microsoft.com/office/drawing/2015/9/8/chartex" xmlns:cx2="http://schemas.microsoft.com/office/drawing/2015/10/21/chartex" xmlns:cx3="http://schemas.microsoft.com/office/drawing/2016/5/9/chartex" xmlns:cx4="http://schemas.microsoft.com/office/drawing/2016/5/10/chartex" xmlns:cx5="http://schemas.microsoft.com/office/drawing/2016/5/11/chartex" xmlns:cx6="http://schemas.microsoft.com/office/drawing/2016/5/12/chartex" xmlns:cx7="http://schemas.microsoft.com/office/drawing/2016/5/13/chartex" xmlns:cx8="http://schemas.microsoft.com/office/drawing/2016/5/14/chartex" xmlns:mc="http://schemas.openxmlformats.org/markup-compatibility/2006" xmlns:o="urn:schemas-microsoft-com:office:office" xmlns:r="http://schemas.openxmlformats.org/officeDocument/2006/relationships" xmlns:m="http://schemas.openxmlformats.org/officeDocument/2006/math" xmlns:v="urn:schemas-microsoft-com:vml" xmlns:wp14="http://schemas.microsoft.com/office/word/2010/wordprocessingDrawing" xmlns:wp="http://schemas.openxmlformats.org/drawingml/2006/wordprocessingDrawing" xmlns:w="http://schemas.openxmlformats.org/wordprocessingml/2006/main" xmlns:w14="http://schemas.microsoft.com/office/word/2010/wordml" xmlns:w10="urn:schemas-microsoft-com:office:word" xmlns:w15="http://schemas.microsoft.com/office/word/2012/wordml" xmlns:wpg="http://schemas.microsoft.com/office/word/2010/wordprocessingGroup" xmlns:wpi="http://schemas.microsoft.com/office/word/2010/wordprocessingInk" xmlns:wne="http://schemas.microsoft.com/office/word/2006/wordml" xmlns:wps="http://schemas.microsoft.com/office/word/2010/wordprocessingShape" xmlns:wpsCustomData="http://www.wps.cn/officeDocument/2013/wpsCustomData" mc:Ignorable="w14 w15 wp14">
   <w:body>
     <w:p>
       <w:pPr>
@@ -243,6 +243,8 @@
         <w:t>适配人群</w:t>
       </w:r>
       <w:bookmarkEnd w:id="5"/>
+      <w:bookmarkStart w:id="34" w:name="_GoBack"/>
+      <w:bookmarkEnd w:id="34"/>
     </w:p>
     <w:p>
       <w:pPr>
@@ -2918,6 +2920,12 @@
             <w:insideH w:val="single" w:color="DEE0E3" w:sz="0" w:space="0"/>
             <w:insideV w:val="single" w:color="DEE0E3" w:sz="0" w:space="0"/>
           </w:tblBorders>
+          <w:tblCellMar>
+            <w:top w:w="0" w:type="dxa"/>
+            <w:left w:w="10" w:type="dxa"/>
+            <w:bottom w:w="0" w:type="dxa"/>
+            <w:right w:w="10" w:type="dxa"/>
+          </w:tblCellMar>
         </w:tblPrEx>
         <w:tc>
           <w:tcPr>
@@ -4215,6 +4223,12 @@
             <w:insideH w:val="single" w:color="DEE0E3" w:sz="0" w:space="0"/>
             <w:insideV w:val="single" w:color="DEE0E3" w:sz="0" w:space="0"/>
           </w:tblBorders>
+          <w:tblCellMar>
+            <w:top w:w="0" w:type="dxa"/>
+            <w:left w:w="10" w:type="dxa"/>
+            <w:bottom w:w="0" w:type="dxa"/>
+            <w:right w:w="10" w:type="dxa"/>
+          </w:tblCellMar>
         </w:tblPrEx>
         <w:tc>
           <w:tcPr>
@@ -4395,12 +4409,6 @@
             <w:insideH w:val="single" w:color="DEE0E3" w:sz="0" w:space="0"/>
             <w:insideV w:val="single" w:color="DEE0E3" w:sz="0" w:space="0"/>
           </w:tblBorders>
-          <w:tblCellMar>
-            <w:top w:w="0" w:type="dxa"/>
-            <w:left w:w="10" w:type="dxa"/>
-            <w:bottom w:w="0" w:type="dxa"/>
-            <w:right w:w="10" w:type="dxa"/>
-          </w:tblCellMar>
         </w:tblPrEx>
         <w:tc>
           <w:tcPr>
@@ -5375,8 +5383,6 @@
         </w:rPr>
         <w:t>食药同源：金银花、玉米须、野生菌、深山野菜。</w:t>
       </w:r>
-      <w:bookmarkStart w:id="34" w:name="_GoBack"/>
-      <w:bookmarkEnd w:id="34"/>
     </w:p>
     <w:p>
       <w:pPr>
@@ -5514,6 +5520,12 @@
             <w:insideH w:val="single" w:color="DEE0E3" w:sz="0" w:space="0"/>
             <w:insideV w:val="single" w:color="DEE0E3" w:sz="0" w:space="0"/>
           </w:tblBorders>
+          <w:tblCellMar>
+            <w:top w:w="0" w:type="dxa"/>
+            <w:left w:w="10" w:type="dxa"/>
+            <w:bottom w:w="0" w:type="dxa"/>
+            <w:right w:w="10" w:type="dxa"/>
+          </w:tblCellMar>
         </w:tblPrEx>
         <w:tc>
           <w:tcPr>
@@ -8230,7 +8242,7 @@
     <w:lsdException w:unhideWhenUsed="0" w:uiPriority="0" w:semiHidden="0" w:name="footnote text"/>
     <w:lsdException w:unhideWhenUsed="0" w:uiPriority="0" w:semiHidden="0" w:name="annotation text"/>
     <w:lsdException w:unhideWhenUsed="0" w:uiPriority="0" w:semiHidden="0" w:name="header"/>
-    <w:lsdException w:unhideWhenUsed="0" w:uiPriority="0" w:semiHidden="0" w:name="footer"/>
+    <w:lsdException w:qFormat="1" w:unhideWhenUsed="0" w:uiPriority="0" w:semiHidden="0" w:name="footer"/>
     <w:lsdException w:unhideWhenUsed="0" w:uiPriority="0" w:semiHidden="0" w:name="index heading"/>
     <w:lsdException w:qFormat="1" w:uiPriority="0" w:name="caption"/>
     <w:lsdException w:unhideWhenUsed="0" w:uiPriority="0" w:semiHidden="0" w:name="table of figures"/>
@@ -8263,7 +8275,7 @@
     <w:lsdException w:qFormat="1" w:unhideWhenUsed="0" w:uiPriority="0" w:semiHidden="0" w:name="Title"/>
     <w:lsdException w:unhideWhenUsed="0" w:uiPriority="0" w:semiHidden="0" w:name="Closing"/>
     <w:lsdException w:unhideWhenUsed="0" w:uiPriority="0" w:semiHidden="0" w:name="Signature"/>
-    <w:lsdException w:unhideWhenUsed="0" w:uiPriority="0" w:name="Default Paragraph Font"/>
+    <w:lsdException w:qFormat="1" w:unhideWhenUsed="0" w:uiPriority="0" w:name="Default Paragraph Font"/>
     <w:lsdException w:unhideWhenUsed="0" w:uiPriority="0" w:semiHidden="0" w:name="Body Text"/>
     <w:lsdException w:unhideWhenUsed="0" w:uiPriority="0" w:semiHidden="0" w:name="Body Text Indent"/>
     <w:lsdException w:unhideWhenUsed="0" w:uiPriority="0" w:semiHidden="0" w:name="List Continue"/>
@@ -8301,7 +8313,7 @@
     <w:lsdException w:unhideWhenUsed="0" w:uiPriority="0" w:semiHidden="0" w:name="HTML Sample"/>
     <w:lsdException w:unhideWhenUsed="0" w:uiPriority="0" w:semiHidden="0" w:name="HTML Typewriter"/>
     <w:lsdException w:unhideWhenUsed="0" w:uiPriority="0" w:semiHidden="0" w:name="HTML Variable"/>
-    <w:lsdException w:unhideWhenUsed="0" w:uiPriority="0" w:name="Normal Table"/>
+    <w:lsdException w:qFormat="1" w:unhideWhenUsed="0" w:uiPriority="0" w:name="Normal Table"/>
     <w:lsdException w:unhideWhenUsed="0" w:uiPriority="0" w:semiHidden="0" w:name="annotation subject"/>
     <w:lsdException w:unhideWhenUsed="0" w:uiPriority="0" w:semiHidden="0" w:name="Table Simple 1"/>
     <w:lsdException w:unhideWhenUsed="0" w:uiPriority="0" w:semiHidden="0" w:name="Table Simple 2"/>
@@ -8456,6 +8468,7 @@
       <w:jc w:val="both"/>
     </w:pPr>
     <w:rPr>
+      <w:rFonts w:asciiTheme="minorHAnsi" w:hAnsiTheme="minorHAnsi" w:eastAsiaTheme="minorEastAsia" w:cstheme="minorBidi"/>
       <w:sz w:val="21"/>
       <w:szCs w:val="22"/>
     </w:rPr>
@@ -8463,11 +8476,13 @@
   <w:style w:type="character" w:default="1" w:styleId="4">
     <w:name w:val="Default Paragraph Font"/>
     <w:semiHidden/>
+    <w:qFormat/>
     <w:uiPriority w:val="0"/>
   </w:style>
   <w:style w:type="table" w:default="1" w:styleId="3">
     <w:name w:val="Normal Table"/>
     <w:semiHidden/>
+    <w:qFormat/>
     <w:uiPriority w:val="0"/>
     <w:tblPr>
       <w:tblCellMar>
@@ -8481,6 +8496,7 @@
   <w:style w:type="paragraph" w:styleId="2">
     <w:name w:val="footer"/>
     <w:basedOn w:val="1"/>
+    <w:qFormat/>
     <w:uiPriority w:val="0"/>
     <w:pPr>
       <w:tabs>

</xml_diff>